<commit_message>
Modulo B es el concentrador, y fuera encabezado y pie de los documentos sencillos
En los tres documentos Word "pasarela" pasa a "concentrador" con su concordancia, y el del Modulo B se renombra a CHIP_FOREST_concentrador_explicacion_sencilla.docx. Los dos documentos sencillos ya no llevan encabezado ni pie de pagina.

Co-Authored-By: Claude Opus 5.5 <noreply@anthropic.com>
</commit_message>
<xml_diff>
--- a/explicacion/CHIP_FOREST_explicacion_sencilla.docx
+++ b/explicacion/CHIP_FOREST_explicacion_sencilla.docx
@@ -74,7 +74,7 @@
         <w:spacing w:after="120" w:line="276"/>
       </w:pPr>
       <w:r>
-        <w:t xml:space="preserve">Cada cierto tiempo, el nodo manda lo que ha medido por radio a otro aparato, la pasarela, que lo sube a internet para que se pueda ver en una pantalla.</w:t>
+        <w:t xml:space="preserve">Cada cierto tiempo, el nodo manda lo que ha medido por radio a otro aparato, el concentrador, que lo sube a internet para que se pueda ver en una pantalla.</w:t>
       </w:r>
     </w:p>
     <w:p>
@@ -545,7 +545,7 @@
         <w:spacing w:after="120" w:line="276"/>
       </w:pPr>
       <w:r>
-        <w:t xml:space="preserve">Y cada 30 minutos manda todo lo que ha medido a la pasarela.</w:t>
+        <w:t xml:space="preserve">Y cada 30 minutos manda todo lo que ha medido al concentrador.</w:t>
       </w:r>
     </w:p>
     <w:p>
@@ -569,7 +569,7 @@
         <w:spacing w:after="120" w:line="276"/>
       </w:pPr>
       <w:r>
-        <w:t xml:space="preserve">El nodo no tiene un reloj de verdad, así que su forma de contar el tiempo se va desviando un poco. Para corregirlo, cada vez que manda datos, la pasarela le dice la hora exacta y el nodo se pone en hora.</w:t>
+        <w:t xml:space="preserve">El nodo no tiene un reloj de verdad, así que su forma de contar el tiempo se va desviando un poco. Para corregirlo, cada vez que manda datos, el concentrador le dice la hora exacta y el nodo se pone en hora.</w:t>
       </w:r>
     </w:p>
     <w:p>
@@ -1734,7 +1734,7 @@
         <w:spacing w:after="120" w:line="276"/>
       </w:pPr>
       <w:r>
-        <w:t xml:space="preserve">Además, en cuanto el nodo entra en alerta, lo comunica, y la pasarela lo sube a internet en ese mismo momento, sin esperar.</w:t>
+        <w:t xml:space="preserve">Además, en cuanto el nodo entra en alerta, lo comunica, y el concentrador lo sube a internet en ese mismo momento, sin esperar.</w:t>
       </w:r>
     </w:p>
     <w:p>
@@ -1820,8 +1820,6 @@
       </w:r>
     </w:p>
     <w:sectPr>
-      <w:headerReference w:type="default" r:id="rId6"/>
-      <w:footerReference w:type="default" r:id="rId7"/>
       <w:pgSz w:w="11906" w:h="16838" w:orient="portrait"/>
       <w:pgMar w:top="1440" w:right="1440" w:bottom="1440" w:left="1440" w:header="708" w:footer="708" w:gutter="0"/>
       <w:pgNumType/>
@@ -1835,33 +1833,6 @@
 <w:comments xmlns:cx="http://schemas.microsoft.com/office/drawing/2014/chartex" xmlns:cx1="http://schemas.microsoft.com/office/drawing/2015/9/8/chartex" xmlns:cx2="http://schemas.microsoft.com/office/drawing/2015/10/21/chartex" xmlns:cx3="http://schemas.microsoft.com/office/drawing/2016/5/9/chartex" xmlns:cx4="http://schemas.microsoft.com/office/drawing/2016/5/10/chartex" xmlns:cx5="http://schemas.microsoft.com/office/drawing/2016/5/11/chartex" xmlns:cx6="http://schemas.microsoft.com/office/drawing/2016/5/12/chartex" xmlns:cx7="http://schemas.microsoft.com/office/drawing/2016/5/13/chartex" xmlns:cx8="http://schemas.microsoft.com/office/drawing/2016/5/14/chartex" xmlns:mc="http://schemas.openxmlformats.org/markup-compatibility/2006" xmlns:aink="http://schemas.microsoft.com/office/drawing/2016/ink" xmlns:am3d="http://schemas.microsoft.com/office/drawing/2017/model3d" xmlns:o="urn:schemas-microsoft-com:office:office" xmlns:r="http://schemas.openxmlformats.org/officeDocument/2006/relationships" xmlns:m="http://schemas.openxmlformats.org/officeDocument/2006/math" xmlns:v="urn:schemas-microsoft-com:vml" xmlns:wp14="http://schemas.microsoft.com/office/word/2010/wordprocessingDrawing" xmlns:wp="http://schemas.openxmlformats.org/drawingml/2006/wordprocessingDrawing" xmlns:w10="urn:schemas-microsoft-com:office:word" xmlns:w="http://schemas.openxmlformats.org/wordprocessingml/2006/main" xmlns:w14="http://schemas.microsoft.com/office/word/2010/wordml" xmlns:w15="http://schemas.microsoft.com/office/word/2012/wordml" xmlns:w16cex="http://schemas.microsoft.com/office/word/2018/wordml/cex" xmlns:w16cid="http://schemas.microsoft.com/office/word/2016/wordml/cid" xmlns:w16="http://schemas.microsoft.com/office/word/2018/wordml" xmlns:w16sdtdh="http://schemas.microsoft.com/office/word/2020/wordml/sdtdatahash" xmlns:w16se="http://schemas.microsoft.com/office/word/2015/wordml/symex" xmlns:wpg="http://schemas.microsoft.com/office/word/2010/wordprocessingGroup" xmlns:wpi="http://schemas.microsoft.com/office/word/2010/wordprocessingInk" xmlns:wne="http://schemas.microsoft.com/office/word/2006/wordml" xmlns:wps="http://schemas.microsoft.com/office/word/2010/wordprocessingShape"/>
 </file>
 
-<file path=word/footer1.xml><?xml version="1.0" encoding="utf-8"?>
-<w:ftr xmlns:wpc="http://schemas.microsoft.com/office/word/2010/wordprocessingCanvas" xmlns:mc="http://schemas.openxmlformats.org/markup-compatibility/2006" xmlns:o="urn:schemas-microsoft-com:office:office" xmlns:r="http://schemas.openxmlformats.org/officeDocument/2006/relationships" xmlns:m="http://schemas.openxmlformats.org/officeDocument/2006/math" xmlns:v="urn:schemas-microsoft-com:vml" xmlns:wp14="http://schemas.microsoft.com/office/word/2010/wordprocessingDrawing" xmlns:wp="http://schemas.openxmlformats.org/drawingml/2006/wordprocessingDrawing" xmlns:w10="urn:schemas-microsoft-com:office:word" xmlns:w="http://schemas.openxmlformats.org/wordprocessingml/2006/main" xmlns:w14="http://schemas.microsoft.com/office/word/2010/wordml" xmlns:w15="http://schemas.microsoft.com/office/word/2012/wordml" xmlns:wpg="http://schemas.microsoft.com/office/word/2010/wordprocessingGroup" xmlns:wpi="http://schemas.microsoft.com/office/word/2010/wordprocessingInk" xmlns:wne="http://schemas.microsoft.com/office/word/2006/wordml" xmlns:wps="http://schemas.microsoft.com/office/word/2010/wordprocessingShape">
-  <w:p>
-    <w:pPr>
-      <w:jc w:val="center"/>
-    </w:pPr>
-    <w:r>
-      <w:rPr>
-        <w:color w:val="808080"/>
-        <w:sz w:val="16"/>
-        <w:szCs w:val="16"/>
-      </w:rPr>
-      <w:t xml:space="preserve">Página </w:t>
-      <w:fldChar w:fldCharType="begin"/>
-      <w:instrText xml:space="preserve">PAGE</w:instrText>
-      <w:fldChar w:fldCharType="separate"/>
-      <w:fldChar w:fldCharType="end"/>
-      <w:t xml:space="preserve"> de </w:t>
-      <w:fldChar w:fldCharType="begin"/>
-      <w:instrText xml:space="preserve">NUMPAGES</w:instrText>
-      <w:fldChar w:fldCharType="separate"/>
-      <w:fldChar w:fldCharType="end"/>
-    </w:r>
-  </w:p>
-</w:ftr>
-</file>
-
 <file path=word/footnotes.xml><?xml version="1.0" encoding="utf-8"?>
 <w:footnotes xmlns:wpc="http://schemas.microsoft.com/office/word/2010/wordprocessingCanvas" xmlns:mc="http://schemas.openxmlformats.org/markup-compatibility/2006" xmlns:o="urn:schemas-microsoft-com:office:office" xmlns:r="http://schemas.openxmlformats.org/officeDocument/2006/relationships" xmlns:m="http://schemas.openxmlformats.org/officeDocument/2006/math" xmlns:v="urn:schemas-microsoft-com:vml" xmlns:wp14="http://schemas.microsoft.com/office/word/2010/wordprocessingDrawing" xmlns:wp="http://schemas.openxmlformats.org/drawingml/2006/wordprocessingDrawing" xmlns:w10="urn:schemas-microsoft-com:office:word" xmlns:w="http://schemas.openxmlformats.org/wordprocessingml/2006/main" xmlns:w14="http://schemas.microsoft.com/office/word/2010/wordml" xmlns:w15="http://schemas.microsoft.com/office/word/2012/wordml" xmlns:wpg="http://schemas.microsoft.com/office/word/2010/wordprocessingGroup" xmlns:wpi="http://schemas.microsoft.com/office/word/2010/wordprocessingInk" xmlns:wne="http://schemas.microsoft.com/office/word/2006/wordml" xmlns:wps="http://schemas.microsoft.com/office/word/2010/wordprocessingShape" mc:Ignorable="w14 w15 wp14">
   <w:footnote w:type="separator" w:id="-1">
@@ -1897,24 +1868,6 @@
     </w:p>
   </w:footnote>
 </w:footnotes>
-</file>
-
-<file path=word/header1.xml><?xml version="1.0" encoding="utf-8"?>
-<w:hdr xmlns:wpc="http://schemas.microsoft.com/office/word/2010/wordprocessingCanvas" xmlns:mc="http://schemas.openxmlformats.org/markup-compatibility/2006" xmlns:o="urn:schemas-microsoft-com:office:office" xmlns:r="http://schemas.openxmlformats.org/officeDocument/2006/relationships" xmlns:m="http://schemas.openxmlformats.org/officeDocument/2006/math" xmlns:v="urn:schemas-microsoft-com:vml" xmlns:wp14="http://schemas.microsoft.com/office/word/2010/wordprocessingDrawing" xmlns:wp="http://schemas.openxmlformats.org/drawingml/2006/wordprocessingDrawing" xmlns:w10="urn:schemas-microsoft-com:office:word" xmlns:w="http://schemas.openxmlformats.org/wordprocessingml/2006/main" xmlns:w14="http://schemas.microsoft.com/office/word/2010/wordml" xmlns:w15="http://schemas.microsoft.com/office/word/2012/wordml" xmlns:wpg="http://schemas.microsoft.com/office/word/2010/wordprocessingGroup" xmlns:wpi="http://schemas.microsoft.com/office/word/2010/wordprocessingInk" xmlns:wne="http://schemas.microsoft.com/office/word/2006/wordml" xmlns:wps="http://schemas.microsoft.com/office/word/2010/wordprocessingShape" xmlns:cx="http://schemas.microsoft.com/office/drawing/2014/chartex" xmlns:cx1="http://schemas.microsoft.com/office/drawing/2015/9/8/chartex" xmlns:cx2="http://schemas.microsoft.com/office/drawing/2015/10/21/chartex" xmlns:cx3="http://schemas.microsoft.com/office/drawing/2016/5/9/chartex" xmlns:cx4="http://schemas.microsoft.com/office/drawing/2016/5/10/chartex" xmlns:cx5="http://schemas.microsoft.com/office/drawing/2016/5/11/chartex" xmlns:cx6="http://schemas.microsoft.com/office/drawing/2016/5/12/chartex" xmlns:cx7="http://schemas.microsoft.com/office/drawing/2016/5/13/chartex" xmlns:cx8="http://schemas.microsoft.com/office/drawing/2016/5/14/chartex" xmlns:w16cid="http://schemas.microsoft.com/office/word/2016/wordml/cid" xmlns:w16se="http://schemas.microsoft.com/office/word/2015/wordml/symex">
-  <w:p>
-    <w:pPr>
-      <w:jc w:val="right"/>
-    </w:pPr>
-    <w:r>
-      <w:rPr>
-        <w:color w:val="808080"/>
-        <w:sz w:val="16"/>
-        <w:szCs w:val="16"/>
-      </w:rPr>
-      <w:t xml:space="preserve">CHIP FOREST — Explicación sencilla</w:t>
-    </w:r>
-  </w:p>
-</w:hdr>
 </file>
 
 <file path=word/numbering.xml><?xml version="1.0" encoding="utf-8"?>

</xml_diff>